<commit_message>
Add the My path card: one-page family handout (PDF, blank partner copy, web page at /my-path), linked from onboarding, the landing page, the privacy page and the Core Path page
Co-Authored-By: Claude Sonnet 5.5 <noreply@anthropic.com>
</commit_message>
<xml_diff>
--- a/docs/Core-Curriculum.docx
+++ b/docs/Core-Curriculum.docx
@@ -381,6 +381,75 @@
                 <w:sz w:val="18"/>
               </w:rPr>
               <w:t>Birth year shown on the profile</w:t>
+            </w:r>
+          </w:p>
+        </w:tc>
+      </w:tr>
+      <w:tr>
+        <w:tc>
+          <w:tcPr>
+            <w:tcW w:type="dxa" w:w="3137"/>
+          </w:tcPr>
+          <w:p>
+            <w:r>
+              <w:rPr>
+                <w:sz w:val="18"/>
+              </w:rPr>
+            </w:r>
+            <w:r>
+              <w:rPr>
+                <w:sz w:val="18"/>
+              </w:rPr>
+              <w:t xml:space="preserve">Hand each family the </w:t>
+            </w:r>
+            <w:r>
+              <w:rPr>
+                <w:b/>
+                <w:sz w:val="18"/>
+              </w:rPr>
+              <w:t>My path card</w:t>
+            </w:r>
+            <w:r>
+              <w:rPr>
+                <w:sz w:val="18"/>
+              </w:rPr>
+              <w:t>: what this is about, the path, and how their child is kept safe</w:t>
+            </w:r>
+          </w:p>
+        </w:tc>
+        <w:tc>
+          <w:tcPr>
+            <w:tcW w:type="dxa" w:w="3137"/>
+          </w:tcPr>
+          <w:p>
+            <w:r>
+              <w:rPr>
+                <w:sz w:val="18"/>
+              </w:rPr>
+            </w:r>
+            <w:r>
+              <w:rPr>
+                <w:sz w:val="18"/>
+              </w:rPr>
+              <w:t>Leader</w:t>
+            </w:r>
+          </w:p>
+        </w:tc>
+        <w:tc>
+          <w:tcPr>
+            <w:tcW w:type="dxa" w:w="3137"/>
+          </w:tcPr>
+          <w:p>
+            <w:r>
+              <w:rPr>
+                <w:sz w:val="18"/>
+              </w:rPr>
+            </w:r>
+            <w:r>
+              <w:rPr>
+                <w:sz w:val="18"/>
+              </w:rPr>
+              <w:t>Family has it with the consent form</w:t>
             </w:r>
           </w:p>
         </w:tc>
@@ -2745,10 +2814,10 @@
         <w:rPr>
           <w:b/>
         </w:rPr>
-        <w:t>A published, one-page learner version of this path does not yet exist.</w:t>
+        <w:t>The My path card is new.</w:t>
       </w:r>
       <w:r>
-        <w:t xml:space="preserve"> The platform has the Core Path page and the AI Discovery guide; a printable "my path" card would help learners and families.</w:t>
+        <w:t xml:space="preserve"> It explains the path to families on one page (and at nextvillage.community/my-path). We have not yet asked parents whether it answers their questions; ask leaders to report what families say.</w:t>
       </w:r>
     </w:p>
     <w:p>
@@ -2852,6 +2921,58 @@
                 <w:sz w:val="18"/>
               </w:rPr>
               <w:t>Tutorials, "The Core Path"</w:t>
+            </w:r>
+          </w:p>
+        </w:tc>
+      </w:tr>
+      <w:tr>
+        <w:tc>
+          <w:tcPr>
+            <w:tcW w:type="dxa" w:w="4706"/>
+          </w:tcPr>
+          <w:p>
+            <w:r>
+              <w:rPr>
+                <w:sz w:val="18"/>
+              </w:rPr>
+            </w:r>
+            <w:r>
+              <w:rPr>
+                <w:sz w:val="18"/>
+              </w:rPr>
+              <w:t>My path card (families)</w:t>
+            </w:r>
+          </w:p>
+        </w:tc>
+        <w:tc>
+          <w:tcPr>
+            <w:tcW w:type="dxa" w:w="4706"/>
+          </w:tcPr>
+          <w:p>
+            <w:r>
+              <w:rPr>
+                <w:sz w:val="18"/>
+              </w:rPr>
+            </w:r>
+            <w:r>
+              <w:rPr>
+                <w:rFonts w:ascii="Consolas" w:hAnsi="Consolas"/>
+                <w:sz w:val="18"/>
+              </w:rPr>
+              <w:t>/my-path</w:t>
+            </w:r>
+            <w:r>
+              <w:rPr>
+                <w:sz w:val="18"/>
+              </w:rPr>
+              <w:t xml:space="preserve"> and </w:t>
+            </w:r>
+            <w:r>
+              <w:rPr>
+                <w:rFonts w:ascii="Consolas" w:hAnsi="Consolas"/>
+                <w:sz w:val="18"/>
+              </w:rPr>
+              <w:t>public/docs/My-Path-Card.pdf</w:t>
             </w:r>
           </w:p>
         </w:tc>

</xml_diff>

<commit_message>
Add the My path card: one-page family handout (PDF, blank partner copy, web page at /my-path), linked from onboarding, the landing page, the privacy page and the Core Path page (#307)
Co-authored-by: Claude Sonnet 5.5 <noreply@anthropic.com>
</commit_message>
<xml_diff>
--- a/docs/Core-Curriculum.docx
+++ b/docs/Core-Curriculum.docx
@@ -381,6 +381,75 @@
                 <w:sz w:val="18"/>
               </w:rPr>
               <w:t>Birth year shown on the profile</w:t>
+            </w:r>
+          </w:p>
+        </w:tc>
+      </w:tr>
+      <w:tr>
+        <w:tc>
+          <w:tcPr>
+            <w:tcW w:type="dxa" w:w="3137"/>
+          </w:tcPr>
+          <w:p>
+            <w:r>
+              <w:rPr>
+                <w:sz w:val="18"/>
+              </w:rPr>
+            </w:r>
+            <w:r>
+              <w:rPr>
+                <w:sz w:val="18"/>
+              </w:rPr>
+              <w:t xml:space="preserve">Hand each family the </w:t>
+            </w:r>
+            <w:r>
+              <w:rPr>
+                <w:b/>
+                <w:sz w:val="18"/>
+              </w:rPr>
+              <w:t>My path card</w:t>
+            </w:r>
+            <w:r>
+              <w:rPr>
+                <w:sz w:val="18"/>
+              </w:rPr>
+              <w:t>: what this is about, the path, and how their child is kept safe</w:t>
+            </w:r>
+          </w:p>
+        </w:tc>
+        <w:tc>
+          <w:tcPr>
+            <w:tcW w:type="dxa" w:w="3137"/>
+          </w:tcPr>
+          <w:p>
+            <w:r>
+              <w:rPr>
+                <w:sz w:val="18"/>
+              </w:rPr>
+            </w:r>
+            <w:r>
+              <w:rPr>
+                <w:sz w:val="18"/>
+              </w:rPr>
+              <w:t>Leader</w:t>
+            </w:r>
+          </w:p>
+        </w:tc>
+        <w:tc>
+          <w:tcPr>
+            <w:tcW w:type="dxa" w:w="3137"/>
+          </w:tcPr>
+          <w:p>
+            <w:r>
+              <w:rPr>
+                <w:sz w:val="18"/>
+              </w:rPr>
+            </w:r>
+            <w:r>
+              <w:rPr>
+                <w:sz w:val="18"/>
+              </w:rPr>
+              <w:t>Family has it with the consent form</w:t>
             </w:r>
           </w:p>
         </w:tc>
@@ -2745,10 +2814,10 @@
         <w:rPr>
           <w:b/>
         </w:rPr>
-        <w:t>A published, one-page learner version of this path does not yet exist.</w:t>
+        <w:t>The My path card is new.</w:t>
       </w:r>
       <w:r>
-        <w:t xml:space="preserve"> The platform has the Core Path page and the AI Discovery guide; a printable "my path" card would help learners and families.</w:t>
+        <w:t xml:space="preserve"> It explains the path to families on one page (and at nextvillage.community/my-path). We have not yet asked parents whether it answers their questions; ask leaders to report what families say.</w:t>
       </w:r>
     </w:p>
     <w:p>
@@ -2852,6 +2921,58 @@
                 <w:sz w:val="18"/>
               </w:rPr>
               <w:t>Tutorials, "The Core Path"</w:t>
+            </w:r>
+          </w:p>
+        </w:tc>
+      </w:tr>
+      <w:tr>
+        <w:tc>
+          <w:tcPr>
+            <w:tcW w:type="dxa" w:w="4706"/>
+          </w:tcPr>
+          <w:p>
+            <w:r>
+              <w:rPr>
+                <w:sz w:val="18"/>
+              </w:rPr>
+            </w:r>
+            <w:r>
+              <w:rPr>
+                <w:sz w:val="18"/>
+              </w:rPr>
+              <w:t>My path card (families)</w:t>
+            </w:r>
+          </w:p>
+        </w:tc>
+        <w:tc>
+          <w:tcPr>
+            <w:tcW w:type="dxa" w:w="4706"/>
+          </w:tcPr>
+          <w:p>
+            <w:r>
+              <w:rPr>
+                <w:sz w:val="18"/>
+              </w:rPr>
+            </w:r>
+            <w:r>
+              <w:rPr>
+                <w:rFonts w:ascii="Consolas" w:hAnsi="Consolas"/>
+                <w:sz w:val="18"/>
+              </w:rPr>
+              <w:t>/my-path</w:t>
+            </w:r>
+            <w:r>
+              <w:rPr>
+                <w:sz w:val="18"/>
+              </w:rPr>
+              <w:t xml:space="preserve"> and </w:t>
+            </w:r>
+            <w:r>
+              <w:rPr>
+                <w:rFonts w:ascii="Consolas" w:hAnsi="Consolas"/>
+                <w:sz w:val="18"/>
+              </w:rPr>
+              <w:t>public/docs/My-Path-Card.pdf</w:t>
             </w:r>
           </w:p>
         </w:tc>

</xml_diff>